<commit_message>
Update translation content and resources for multiple languages for 2026-06-29 release
</commit_message>
<xml_diff>
--- a/arb/docx/006.content.docx
+++ b/arb/docx/006.content.docx
@@ -4082,6 +4082,378 @@
         <w:rPr>
           <w:lang w:val="ar_AE" w:bidi="ar_AE"/>
         </w:rPr>
+        <w:t>حجر الزاوية</w:t>
+      </w:r>
+      <w:r>
+        <w:rPr>
+          <w:lang w:val="ar_AE" w:bidi="ar_AE"/>
+        </w:rPr>
+      </w:r>
+    </w:p>
+    <w:p>
+      <w:pPr>
+        <w:pStyle w:val="Heading3"/>
+        <w:bidi/>
+      </w:pPr>
+      <w:r>
+        <w:rPr>
+          <w:lang w:val="ar_AE" w:bidi="ar_AE"/>
+        </w:rPr>
+        <w:t>التعريف:</w:t>
+      </w:r>
+    </w:p>
+    <w:p>
+      <w:pPr>
+        <w:bidi/>
+      </w:pPr>
+      <w:r>
+        <w:rPr>
+          <w:lang w:val="ar_AE" w:bidi="ar_AE"/>
+        </w:rPr>
+      </w:r>
+      <w:r>
+        <w:rPr>
+          <w:lang w:val="ar_AE" w:bidi="ar_AE"/>
+        </w:rPr>
+        <w:t>إن مصطلح "حجر الزاوية" يشير إلى حجر كبير تم قطعه بشكل خاص ووضعه في زاوية أساس المبنى.</w:t>
+      </w:r>
+    </w:p>
+    <w:p>
+      <w:pPr>
+        <w:pStyle w:val="ListBullet"/>
+        <w:bidi/>
+        <w:spacing w:line="240" w:lineRule="auto"/>
+        <w:ind w:left="720"/>
+      </w:pPr>
+      <w:r>
+        <w:rPr>
+          <w:lang w:val="ar_AE" w:bidi="ar_AE"/>
+        </w:rPr>
+      </w:r>
+      <w:r>
+        <w:rPr>
+          <w:lang w:val="ar_AE" w:bidi="ar_AE"/>
+        </w:rPr>
+        <w:t>يتم قياس ووضع جميع الأحجار الأخرى في المبنى بالمقارنة بحجر الزاوية.</w:t>
+      </w:r>
+    </w:p>
+    <w:p>
+      <w:pPr>
+        <w:pStyle w:val="ListBullet"/>
+        <w:bidi/>
+        <w:spacing w:line="240" w:lineRule="auto"/>
+        <w:ind w:left="720"/>
+      </w:pPr>
+      <w:r>
+        <w:rPr>
+          <w:lang w:val="ar_AE" w:bidi="ar_AE"/>
+        </w:rPr>
+      </w:r>
+      <w:r>
+        <w:rPr>
+          <w:lang w:val="ar_AE" w:bidi="ar_AE"/>
+        </w:rPr>
+        <w:t>إنه مهم جدًا لقوة واستقرار البناء بأكمله.</w:t>
+      </w:r>
+    </w:p>
+    <w:p>
+      <w:pPr>
+        <w:pStyle w:val="ListBullet"/>
+        <w:bidi/>
+        <w:spacing w:line="240" w:lineRule="auto"/>
+        <w:ind w:left="720"/>
+      </w:pPr>
+      <w:r>
+        <w:rPr>
+          <w:lang w:val="ar_AE" w:bidi="ar_AE"/>
+        </w:rPr>
+      </w:r>
+      <w:r>
+        <w:rPr>
+          <w:lang w:val="ar_AE" w:bidi="ar_AE"/>
+        </w:rPr>
+        <w:t>في العهد الجديد، يتم تشبيه جماعة المؤمنين ببناء ويسوع المسيح هو "حجر الزاوية" لهذا البناء.</w:t>
+      </w:r>
+    </w:p>
+    <w:p>
+      <w:pPr>
+        <w:pStyle w:val="ListBullet"/>
+        <w:bidi/>
+        <w:spacing w:line="240" w:lineRule="auto"/>
+        <w:ind w:left="720"/>
+      </w:pPr>
+      <w:r>
+        <w:rPr>
+          <w:lang w:val="ar_AE" w:bidi="ar_AE"/>
+        </w:rPr>
+      </w:r>
+      <w:r>
+        <w:rPr>
+          <w:lang w:val="ar_AE" w:bidi="ar_AE"/>
+        </w:rPr>
+        <w:t>بنفس الطريقة التي يدعم بها حجر الزاوية البناء ويحدد موقعه بأكمله، فإن يسوع المسيح هو حجر الزاوية الذي تأسست عليه جماعة المؤمنين وهو دعامتها ومصدر ثباتها.</w:t>
+      </w:r>
+    </w:p>
+    <w:p>
+      <w:pPr>
+        <w:pStyle w:val="Heading3"/>
+        <w:bidi/>
+      </w:pPr>
+      <w:r>
+        <w:rPr>
+          <w:lang w:val="ar_AE" w:bidi="ar_AE"/>
+        </w:rPr>
+        <w:t>اقتراحات الترجمة:</w:t>
+      </w:r>
+    </w:p>
+    <w:p>
+      <w:pPr>
+        <w:pStyle w:val="ListBullet"/>
+        <w:bidi/>
+        <w:spacing w:line="240" w:lineRule="auto"/>
+        <w:ind w:left="720"/>
+      </w:pPr>
+      <w:r>
+        <w:rPr>
+          <w:lang w:val="ar_AE" w:bidi="ar_AE"/>
+        </w:rPr>
+      </w:r>
+      <w:r>
+        <w:rPr>
+          <w:lang w:val="ar_AE" w:bidi="ar_AE"/>
+        </w:rPr>
+        <w:t>يمكن أيضًا ترجمة مصطلح "حجر الزاوية" كـ "حجر البناء الرئيسي" أو "حجر الأساس".</w:t>
+      </w:r>
+    </w:p>
+    <w:p>
+      <w:pPr>
+        <w:pStyle w:val="ListBullet"/>
+        <w:bidi/>
+        <w:spacing w:line="240" w:lineRule="auto"/>
+        <w:ind w:left="720"/>
+      </w:pPr>
+      <w:r>
+        <w:rPr>
+          <w:lang w:val="ar_AE" w:bidi="ar_AE"/>
+        </w:rPr>
+      </w:r>
+      <w:r>
+        <w:rPr>
+          <w:lang w:val="ar_AE" w:bidi="ar_AE"/>
+        </w:rPr>
+        <w:t>فكر فيما إذا كانت اللغة المستخدمة تحتوي على مصطلح خاص لجزء من أساس المبنى والذي يكون بمثابة الداعم الرئيسي للبناء. إذا كان الأمر كذلك، فيمكن استخدام هذا المصطلح.</w:t>
+      </w:r>
+    </w:p>
+    <w:p>
+      <w:pPr>
+        <w:pStyle w:val="ListBullet"/>
+        <w:bidi/>
+        <w:spacing w:line="240" w:lineRule="auto"/>
+        <w:ind w:left="720"/>
+      </w:pPr>
+      <w:r>
+        <w:rPr>
+          <w:lang w:val="ar_AE" w:bidi="ar_AE"/>
+        </w:rPr>
+      </w:r>
+      <w:r>
+        <w:rPr>
+          <w:lang w:val="ar_AE" w:bidi="ar_AE"/>
+        </w:rPr>
+        <w:t>طريقة أخرى لترجمة هذا ستكون، "حجر الأساس المستخدم لزاوية المبنى".</w:t>
+      </w:r>
+    </w:p>
+    <w:p>
+      <w:pPr>
+        <w:pStyle w:val="ListBullet"/>
+        <w:bidi/>
+        <w:spacing w:line="240" w:lineRule="auto"/>
+        <w:ind w:left="720"/>
+      </w:pPr>
+      <w:r>
+        <w:rPr>
+          <w:lang w:val="ar_AE" w:bidi="ar_AE"/>
+        </w:rPr>
+      </w:r>
+      <w:r>
+        <w:rPr>
+          <w:lang w:val="ar_AE" w:bidi="ar_AE"/>
+        </w:rPr>
+        <w:t>من المهم الحفاظ على حقيقة أن هذا حجر كبير، يستخدم كمادة بناء صلبة وآمنة. إذا لم تُستخدم الأحجار في بناء المباني، فقد يكون هناك كلمة أخرى يمكن استخدامها تعني "حجر كبير" (مثل "صخرة") ولكن يجب أن تحتوي أيضًا على فكرة أنها قُطعت و حددت بشكل جيد لتناسب البناء.</w:t>
+      </w:r>
+    </w:p>
+    <w:p>
+      <w:pPr>
+        <w:pStyle w:val="Heading3"/>
+        <w:bidi/>
+      </w:pPr>
+      <w:r>
+        <w:rPr>
+          <w:lang w:val="ar_AE" w:bidi="ar_AE"/>
+        </w:rPr>
+        <w:t>مراجع الكتاب المقدس:</w:t>
+      </w:r>
+    </w:p>
+    <w:p>
+      <w:pPr>
+        <w:pStyle w:val="ListBullet"/>
+        <w:bidi/>
+        <w:spacing w:line="240" w:lineRule="auto"/>
+        <w:ind w:left="720"/>
+      </w:pPr>
+      <w:r>
+        <w:rPr>
+          <w:lang w:val="ar_AE" w:bidi="ar_AE"/>
+        </w:rPr>
+      </w:r>
+      <w:hyperlink r:id="rId70">
+        <w:r>
+          <w:rPr>
+            <w:lang w:val="ar_AE" w:bidi="ar_AE"/>
+          </w:rPr>
+          <w:rPr>
+            <w:color w:val="0000EE"/>
+            <w:u w:val="single"/>
+          </w:rPr>
+          <w:t>أعمال الرسل 4: 11</w:t>
+        </w:r>
+      </w:hyperlink>
+    </w:p>
+    <w:p>
+      <w:pPr>
+        <w:pStyle w:val="ListBullet"/>
+        <w:bidi/>
+        <w:spacing w:line="240" w:lineRule="auto"/>
+        <w:ind w:left="720"/>
+      </w:pPr>
+      <w:r>
+        <w:rPr>
+          <w:lang w:val="ar_AE" w:bidi="ar_AE"/>
+        </w:rPr>
+      </w:r>
+      <w:hyperlink r:id="rId71">
+        <w:r>
+          <w:rPr>
+            <w:lang w:val="ar_AE" w:bidi="ar_AE"/>
+          </w:rPr>
+          <w:rPr>
+            <w:color w:val="0000EE"/>
+            <w:u w:val="single"/>
+          </w:rPr>
+          <w:t>أفسس 2: 20</w:t>
+        </w:r>
+      </w:hyperlink>
+    </w:p>
+    <w:p>
+      <w:pPr>
+        <w:pStyle w:val="ListBullet"/>
+        <w:bidi/>
+        <w:spacing w:line="240" w:lineRule="auto"/>
+        <w:ind w:left="720"/>
+      </w:pPr>
+      <w:r>
+        <w:rPr>
+          <w:lang w:val="ar_AE" w:bidi="ar_AE"/>
+        </w:rPr>
+      </w:r>
+      <w:hyperlink r:id="rId72">
+        <w:r>
+          <w:rPr>
+            <w:lang w:val="ar_AE" w:bidi="ar_AE"/>
+          </w:rPr>
+          <w:rPr>
+            <w:color w:val="0000EE"/>
+            <w:u w:val="single"/>
+          </w:rPr>
+          <w:t>متى 21: 42</w:t>
+        </w:r>
+      </w:hyperlink>
+    </w:p>
+    <w:p>
+      <w:pPr>
+        <w:pStyle w:val="ListBullet"/>
+        <w:bidi/>
+        <w:spacing w:line="240" w:lineRule="auto"/>
+        <w:ind w:left="720"/>
+      </w:pPr>
+      <w:r>
+        <w:rPr>
+          <w:lang w:val="ar_AE" w:bidi="ar_AE"/>
+        </w:rPr>
+      </w:r>
+      <w:hyperlink r:id="rId73">
+        <w:r>
+          <w:rPr>
+            <w:lang w:val="ar_AE" w:bidi="ar_AE"/>
+          </w:rPr>
+          <w:rPr>
+            <w:color w:val="0000EE"/>
+            <w:u w:val="single"/>
+          </w:rPr>
+          <w:t>مزامير 118 :22</w:t>
+        </w:r>
+      </w:hyperlink>
+    </w:p>
+    <w:p>
+      <w:pPr>
+        <w:pStyle w:val="Heading3"/>
+        <w:bidi/>
+      </w:pPr>
+      <w:r>
+        <w:rPr>
+          <w:lang w:val="ar_AE" w:bidi="ar_AE"/>
+        </w:rPr>
+        <w:t>بيانات الكلمة:</w:t>
+      </w:r>
+    </w:p>
+    <w:p>
+      <w:pPr>
+        <w:pStyle w:val="ListBullet"/>
+        <w:bidi/>
+        <w:spacing w:line="240" w:lineRule="auto"/>
+        <w:ind w:left="720"/>
+      </w:pPr>
+      <w:r>
+        <w:rPr>
+          <w:lang w:val="ar_AE" w:bidi="ar_AE"/>
+        </w:rPr>
+      </w:r>
+      <w:r>
+        <w:rPr>
+          <w:lang w:val="ar_AE" w:bidi="ar_AE"/>
+        </w:rPr>
+        <w:t>سترونغ: H0068, H6438, H7218, G02040, G11370, G27760, G30370</w:t>
+      </w:r>
+      <w:r>
+        <w:rPr>
+          <w:lang w:val="ar_AE" w:bidi="ar_AE"/>
+        </w:rPr>
+      </w:r>
+      <w:r>
+        <w:rPr>
+          <w:lang w:val="ar_AE" w:bidi="ar_AE"/>
+        </w:rPr>
+      </w:r>
+    </w:p>
+    <w:p>
+      <w:pPr>
+        <w:bidi/>
+      </w:pPr>
+      <w:r>
+        <w:rPr>
+          <w:lang w:val="ar_AE" w:bidi="ar_AE"/>
+        </w:rPr>
+      </w:r>
+    </w:p>
+    <w:p>
+      <w:pPr>
+        <w:pStyle w:val="Heading2"/>
+        <w:bidi/>
+      </w:pPr>
+      <w:r>
+        <w:rPr>
+          <w:lang w:val="ar_AE" w:bidi="ar_AE"/>
+        </w:rPr>
         <w:t>حجر (يَرجُم)</w:t>
       </w:r>
       <w:r>
@@ -4325,7 +4697,7 @@
           <w:lang w:val="ar_AE" w:bidi="ar_AE"/>
         </w:rPr>
       </w:r>
-      <w:hyperlink r:id="rId70">
+      <w:hyperlink r:id="rId74">
         <w:r>
           <w:rPr>
             <w:lang w:val="ar_AE" w:bidi="ar_AE"/>
@@ -4350,7 +4722,7 @@
           <w:lang w:val="ar_AE" w:bidi="ar_AE"/>
         </w:rPr>
       </w:r>
-      <w:hyperlink r:id="rId71">
+      <w:hyperlink r:id="rId75">
         <w:r>
           <w:rPr>
             <w:lang w:val="ar_AE" w:bidi="ar_AE"/>
@@ -4375,7 +4747,7 @@
           <w:lang w:val="ar_AE" w:bidi="ar_AE"/>
         </w:rPr>
       </w:r>
-      <w:hyperlink r:id="rId72">
+      <w:hyperlink r:id="rId76">
         <w:r>
           <w:rPr>
             <w:lang w:val="ar_AE" w:bidi="ar_AE"/>
@@ -4400,7 +4772,7 @@
           <w:lang w:val="ar_AE" w:bidi="ar_AE"/>
         </w:rPr>
       </w:r>
-      <w:hyperlink r:id="rId73">
+      <w:hyperlink r:id="rId77">
         <w:r>
           <w:rPr>
             <w:lang w:val="ar_AE" w:bidi="ar_AE"/>
@@ -4425,7 +4797,7 @@
           <w:lang w:val="ar_AE" w:bidi="ar_AE"/>
         </w:rPr>
       </w:r>
-      <w:hyperlink r:id="rId74">
+      <w:hyperlink r:id="rId78">
         <w:r>
           <w:rPr>
             <w:lang w:val="ar_AE" w:bidi="ar_AE"/>
@@ -4450,7 +4822,7 @@
           <w:lang w:val="ar_AE" w:bidi="ar_AE"/>
         </w:rPr>
       </w:r>
-      <w:hyperlink r:id="rId75">
+      <w:hyperlink r:id="rId79">
         <w:r>
           <w:rPr>
             <w:lang w:val="ar_AE" w:bidi="ar_AE"/>
@@ -4475,7 +4847,7 @@
           <w:lang w:val="ar_AE" w:bidi="ar_AE"/>
         </w:rPr>
       </w:r>
-      <w:hyperlink r:id="rId76">
+      <w:hyperlink r:id="rId80">
         <w:r>
           <w:rPr>
             <w:lang w:val="ar_AE" w:bidi="ar_AE"/>
@@ -4500,7 +4872,7 @@
           <w:lang w:val="ar_AE" w:bidi="ar_AE"/>
         </w:rPr>
       </w:r>
-      <w:hyperlink r:id="rId77">
+      <w:hyperlink r:id="rId81">
         <w:r>
           <w:rPr>
             <w:lang w:val="ar_AE" w:bidi="ar_AE"/>
@@ -4542,378 +4914,6 @@
           <w:lang w:val="ar_AE" w:bidi="ar_AE"/>
         </w:rPr>
         <w:t>سترونج: H0068, H0069, H0810, H1382, H1496, H1530, H2106, H2672, H2687, H2789, H4676, H4678, H5553, H5601, H5619, H6344, H6443, H6697, H6864, H6872, H7275, H7671, H8068, G26420, G29910, G30340, G30350, G30360, G30370, G40740, G43480, G55860</w:t>
-      </w:r>
-      <w:r>
-        <w:rPr>
-          <w:lang w:val="ar_AE" w:bidi="ar_AE"/>
-        </w:rPr>
-      </w:r>
-      <w:r>
-        <w:rPr>
-          <w:lang w:val="ar_AE" w:bidi="ar_AE"/>
-        </w:rPr>
-      </w:r>
-    </w:p>
-    <w:p>
-      <w:pPr>
-        <w:bidi/>
-      </w:pPr>
-      <w:r>
-        <w:rPr>
-          <w:lang w:val="ar_AE" w:bidi="ar_AE"/>
-        </w:rPr>
-      </w:r>
-    </w:p>
-    <w:p>
-      <w:pPr>
-        <w:pStyle w:val="Heading2"/>
-        <w:bidi/>
-      </w:pPr>
-      <w:r>
-        <w:rPr>
-          <w:lang w:val="ar_AE" w:bidi="ar_AE"/>
-        </w:rPr>
-        <w:t>حجر الزاوية</w:t>
-      </w:r>
-      <w:r>
-        <w:rPr>
-          <w:lang w:val="ar_AE" w:bidi="ar_AE"/>
-        </w:rPr>
-      </w:r>
-    </w:p>
-    <w:p>
-      <w:pPr>
-        <w:pStyle w:val="Heading3"/>
-        <w:bidi/>
-      </w:pPr>
-      <w:r>
-        <w:rPr>
-          <w:lang w:val="ar_AE" w:bidi="ar_AE"/>
-        </w:rPr>
-        <w:t>التعريف:</w:t>
-      </w:r>
-    </w:p>
-    <w:p>
-      <w:pPr>
-        <w:bidi/>
-      </w:pPr>
-      <w:r>
-        <w:rPr>
-          <w:lang w:val="ar_AE" w:bidi="ar_AE"/>
-        </w:rPr>
-      </w:r>
-      <w:r>
-        <w:rPr>
-          <w:lang w:val="ar_AE" w:bidi="ar_AE"/>
-        </w:rPr>
-        <w:t>إن مصطلح "حجر الزاوية" يشير إلى حجر كبير تم قطعه بشكل خاص ووضعه في زاوية أساس المبنى.</w:t>
-      </w:r>
-    </w:p>
-    <w:p>
-      <w:pPr>
-        <w:pStyle w:val="ListBullet"/>
-        <w:bidi/>
-        <w:spacing w:line="240" w:lineRule="auto"/>
-        <w:ind w:left="720"/>
-      </w:pPr>
-      <w:r>
-        <w:rPr>
-          <w:lang w:val="ar_AE" w:bidi="ar_AE"/>
-        </w:rPr>
-      </w:r>
-      <w:r>
-        <w:rPr>
-          <w:lang w:val="ar_AE" w:bidi="ar_AE"/>
-        </w:rPr>
-        <w:t>يتم قياس ووضع جميع الأحجار الأخرى في المبنى بالمقارنة بحجر الزاوية.</w:t>
-      </w:r>
-    </w:p>
-    <w:p>
-      <w:pPr>
-        <w:pStyle w:val="ListBullet"/>
-        <w:bidi/>
-        <w:spacing w:line="240" w:lineRule="auto"/>
-        <w:ind w:left="720"/>
-      </w:pPr>
-      <w:r>
-        <w:rPr>
-          <w:lang w:val="ar_AE" w:bidi="ar_AE"/>
-        </w:rPr>
-      </w:r>
-      <w:r>
-        <w:rPr>
-          <w:lang w:val="ar_AE" w:bidi="ar_AE"/>
-        </w:rPr>
-        <w:t>إنه مهم جدًا لقوة واستقرار البناء بأكمله.</w:t>
-      </w:r>
-    </w:p>
-    <w:p>
-      <w:pPr>
-        <w:pStyle w:val="ListBullet"/>
-        <w:bidi/>
-        <w:spacing w:line="240" w:lineRule="auto"/>
-        <w:ind w:left="720"/>
-      </w:pPr>
-      <w:r>
-        <w:rPr>
-          <w:lang w:val="ar_AE" w:bidi="ar_AE"/>
-        </w:rPr>
-      </w:r>
-      <w:r>
-        <w:rPr>
-          <w:lang w:val="ar_AE" w:bidi="ar_AE"/>
-        </w:rPr>
-        <w:t>في العهد الجديد، يتم تشبيه جماعة المؤمنين ببناء ويسوع المسيح هو "حجر الزاوية" لهذا البناء.</w:t>
-      </w:r>
-    </w:p>
-    <w:p>
-      <w:pPr>
-        <w:pStyle w:val="ListBullet"/>
-        <w:bidi/>
-        <w:spacing w:line="240" w:lineRule="auto"/>
-        <w:ind w:left="720"/>
-      </w:pPr>
-      <w:r>
-        <w:rPr>
-          <w:lang w:val="ar_AE" w:bidi="ar_AE"/>
-        </w:rPr>
-      </w:r>
-      <w:r>
-        <w:rPr>
-          <w:lang w:val="ar_AE" w:bidi="ar_AE"/>
-        </w:rPr>
-        <w:t>بنفس الطريقة التي يدعم بها حجر الزاوية البناء ويحدد موقعه بأكمله، فإن يسوع المسيح هو حجر الزاوية الذي تأسست عليه جماعة المؤمنين وهو دعامتها ومصدر ثباتها.</w:t>
-      </w:r>
-    </w:p>
-    <w:p>
-      <w:pPr>
-        <w:pStyle w:val="Heading3"/>
-        <w:bidi/>
-      </w:pPr>
-      <w:r>
-        <w:rPr>
-          <w:lang w:val="ar_AE" w:bidi="ar_AE"/>
-        </w:rPr>
-        <w:t>اقتراحات الترجمة:</w:t>
-      </w:r>
-    </w:p>
-    <w:p>
-      <w:pPr>
-        <w:pStyle w:val="ListBullet"/>
-        <w:bidi/>
-        <w:spacing w:line="240" w:lineRule="auto"/>
-        <w:ind w:left="720"/>
-      </w:pPr>
-      <w:r>
-        <w:rPr>
-          <w:lang w:val="ar_AE" w:bidi="ar_AE"/>
-        </w:rPr>
-      </w:r>
-      <w:r>
-        <w:rPr>
-          <w:lang w:val="ar_AE" w:bidi="ar_AE"/>
-        </w:rPr>
-        <w:t>يمكن أيضًا ترجمة مصطلح "حجر الزاوية" كـ "حجر البناء الرئيسي" أو "حجر الأساس".</w:t>
-      </w:r>
-    </w:p>
-    <w:p>
-      <w:pPr>
-        <w:pStyle w:val="ListBullet"/>
-        <w:bidi/>
-        <w:spacing w:line="240" w:lineRule="auto"/>
-        <w:ind w:left="720"/>
-      </w:pPr>
-      <w:r>
-        <w:rPr>
-          <w:lang w:val="ar_AE" w:bidi="ar_AE"/>
-        </w:rPr>
-      </w:r>
-      <w:r>
-        <w:rPr>
-          <w:lang w:val="ar_AE" w:bidi="ar_AE"/>
-        </w:rPr>
-        <w:t>فكر فيما إذا كانت اللغة المستخدمة تحتوي على مصطلح خاص لجزء من أساس المبنى والذي يكون بمثابة الداعم الرئيسي للبناء. إذا كان الأمر كذلك، فيمكن استخدام هذا المصطلح.</w:t>
-      </w:r>
-    </w:p>
-    <w:p>
-      <w:pPr>
-        <w:pStyle w:val="ListBullet"/>
-        <w:bidi/>
-        <w:spacing w:line="240" w:lineRule="auto"/>
-        <w:ind w:left="720"/>
-      </w:pPr>
-      <w:r>
-        <w:rPr>
-          <w:lang w:val="ar_AE" w:bidi="ar_AE"/>
-        </w:rPr>
-      </w:r>
-      <w:r>
-        <w:rPr>
-          <w:lang w:val="ar_AE" w:bidi="ar_AE"/>
-        </w:rPr>
-        <w:t>طريقة أخرى لترجمة هذا ستكون، "حجر الأساس المستخدم لزاوية المبنى".</w:t>
-      </w:r>
-    </w:p>
-    <w:p>
-      <w:pPr>
-        <w:pStyle w:val="ListBullet"/>
-        <w:bidi/>
-        <w:spacing w:line="240" w:lineRule="auto"/>
-        <w:ind w:left="720"/>
-      </w:pPr>
-      <w:r>
-        <w:rPr>
-          <w:lang w:val="ar_AE" w:bidi="ar_AE"/>
-        </w:rPr>
-      </w:r>
-      <w:r>
-        <w:rPr>
-          <w:lang w:val="ar_AE" w:bidi="ar_AE"/>
-        </w:rPr>
-        <w:t>من المهم الحفاظ على حقيقة أن هذا حجر كبير، يستخدم كمادة بناء صلبة وآمنة. إذا لم تُستخدم الأحجار في بناء المباني، فقد يكون هناك كلمة أخرى يمكن استخدامها تعني "حجر كبير" (مثل "صخرة") ولكن يجب أن تحتوي أيضًا على فكرة أنها قُطعت و حددت بشكل جيد لتناسب البناء.</w:t>
-      </w:r>
-    </w:p>
-    <w:p>
-      <w:pPr>
-        <w:pStyle w:val="Heading3"/>
-        <w:bidi/>
-      </w:pPr>
-      <w:r>
-        <w:rPr>
-          <w:lang w:val="ar_AE" w:bidi="ar_AE"/>
-        </w:rPr>
-        <w:t>مراجع الكتاب المقدس:</w:t>
-      </w:r>
-    </w:p>
-    <w:p>
-      <w:pPr>
-        <w:pStyle w:val="ListBullet"/>
-        <w:bidi/>
-        <w:spacing w:line="240" w:lineRule="auto"/>
-        <w:ind w:left="720"/>
-      </w:pPr>
-      <w:r>
-        <w:rPr>
-          <w:lang w:val="ar_AE" w:bidi="ar_AE"/>
-        </w:rPr>
-      </w:r>
-      <w:hyperlink r:id="rId78">
-        <w:r>
-          <w:rPr>
-            <w:lang w:val="ar_AE" w:bidi="ar_AE"/>
-          </w:rPr>
-          <w:rPr>
-            <w:color w:val="0000EE"/>
-            <w:u w:val="single"/>
-          </w:rPr>
-          <w:t>أعمال الرسل 4: 11</w:t>
-        </w:r>
-      </w:hyperlink>
-    </w:p>
-    <w:p>
-      <w:pPr>
-        <w:pStyle w:val="ListBullet"/>
-        <w:bidi/>
-        <w:spacing w:line="240" w:lineRule="auto"/>
-        <w:ind w:left="720"/>
-      </w:pPr>
-      <w:r>
-        <w:rPr>
-          <w:lang w:val="ar_AE" w:bidi="ar_AE"/>
-        </w:rPr>
-      </w:r>
-      <w:hyperlink r:id="rId79">
-        <w:r>
-          <w:rPr>
-            <w:lang w:val="ar_AE" w:bidi="ar_AE"/>
-          </w:rPr>
-          <w:rPr>
-            <w:color w:val="0000EE"/>
-            <w:u w:val="single"/>
-          </w:rPr>
-          <w:t>أفسس 2: 20</w:t>
-        </w:r>
-      </w:hyperlink>
-    </w:p>
-    <w:p>
-      <w:pPr>
-        <w:pStyle w:val="ListBullet"/>
-        <w:bidi/>
-        <w:spacing w:line="240" w:lineRule="auto"/>
-        <w:ind w:left="720"/>
-      </w:pPr>
-      <w:r>
-        <w:rPr>
-          <w:lang w:val="ar_AE" w:bidi="ar_AE"/>
-        </w:rPr>
-      </w:r>
-      <w:hyperlink r:id="rId80">
-        <w:r>
-          <w:rPr>
-            <w:lang w:val="ar_AE" w:bidi="ar_AE"/>
-          </w:rPr>
-          <w:rPr>
-            <w:color w:val="0000EE"/>
-            <w:u w:val="single"/>
-          </w:rPr>
-          <w:t>متى 21: 42</w:t>
-        </w:r>
-      </w:hyperlink>
-    </w:p>
-    <w:p>
-      <w:pPr>
-        <w:pStyle w:val="ListBullet"/>
-        <w:bidi/>
-        <w:spacing w:line="240" w:lineRule="auto"/>
-        <w:ind w:left="720"/>
-      </w:pPr>
-      <w:r>
-        <w:rPr>
-          <w:lang w:val="ar_AE" w:bidi="ar_AE"/>
-        </w:rPr>
-      </w:r>
-      <w:hyperlink r:id="rId81">
-        <w:r>
-          <w:rPr>
-            <w:lang w:val="ar_AE" w:bidi="ar_AE"/>
-          </w:rPr>
-          <w:rPr>
-            <w:color w:val="0000EE"/>
-            <w:u w:val="single"/>
-          </w:rPr>
-          <w:t>مزامير 118 :22</w:t>
-        </w:r>
-      </w:hyperlink>
-    </w:p>
-    <w:p>
-      <w:pPr>
-        <w:pStyle w:val="Heading3"/>
-        <w:bidi/>
-      </w:pPr>
-      <w:r>
-        <w:rPr>
-          <w:lang w:val="ar_AE" w:bidi="ar_AE"/>
-        </w:rPr>
-        <w:t>بيانات الكلمة:</w:t>
-      </w:r>
-    </w:p>
-    <w:p>
-      <w:pPr>
-        <w:pStyle w:val="ListBullet"/>
-        <w:bidi/>
-        <w:spacing w:line="240" w:lineRule="auto"/>
-        <w:ind w:left="720"/>
-      </w:pPr>
-      <w:r>
-        <w:rPr>
-          <w:lang w:val="ar_AE" w:bidi="ar_AE"/>
-        </w:rPr>
-      </w:r>
-      <w:r>
-        <w:rPr>
-          <w:lang w:val="ar_AE" w:bidi="ar_AE"/>
-        </w:rPr>
-        <w:t>سترونغ: H0068, H6438, H7218, G02040, G11370, G27760, G30370</w:t>
       </w:r>
       <w:r>
         <w:rPr>

</xml_diff>